<commit_message>
Add НУРСАТ folder report (Python console styled PDF, DOCX, script, XLSX) and enlarge terminal font in БАХА and НУРСАТ
</commit_message>
<xml_diff>
--- a/БАХА/Баха_Есеп.docx
+++ b/БАХА/Баха_Есеп.docx
@@ -1257,33 +1257,79 @@
               <w:rPr>
                 <w:rFonts w:ascii="Courier New" w:hAnsi="Courier New"/>
                 <w:color w:val="4ADE80"/>
-                <w:sz w:val="14"/>
+                <w:sz w:val="17"/>
               </w:rPr>
               <w:t>&gt;&gt;&gt; Python Console Output:</w:t>
               <w:br/>
               <w:t>--- 1 ---</w:t>
               <w:br/>
-              <w:t xml:space="preserve">           ID                        Наименование      Категория     Бренд   Город_склада  Цена_USD  Количество_на_складе  Гарантия_мес Рейтинг      Статус Дата_поставки</w:t>
+              <w:t xml:space="preserve">           ID                        Наименование      Категория     Бренд  \</w:t>
               <w:br/>
-              <w:t>0  TECH-10001  SSD накопитель Samsung 980 PRO 1TB  Комплектующие   Samsung         Алматы   1496.02                    31            24  04.янв   В наличии    13.07.2026</w:t>
+              <w:t xml:space="preserve">0  TECH-10001  SSD накопитель Samsung 980 PRO 1TB  Комплектующие   Samsung   </w:t>
               <w:br/>
-              <w:t>1  TECH-10002            Монитор 34" LG UltraWide       Мониторы        LG         Алматы    108.10                    27            24  04.май   В наличии    29.07.2026</w:t>
+              <w:t xml:space="preserve">1  TECH-10002            Монитор 34" LG UltraWide       Мониторы        LG   </w:t>
               <w:br/>
-              <w:t>2  TECH-10003   Клавиатура Logitech MX Mechanical     Клавиатуры  Logitech      Караганда    925.96                    35            12  04.авг   В наличии    09.03.2026</w:t>
+              <w:t xml:space="preserve">2  TECH-10003   Клавиатура Logitech MX Mechanical     Клавиатуры  Logitech   </w:t>
               <w:br/>
-              <w:t>3  TECH-10004    Мышь Logitech G Pro X Superlight           Мыши  Logitech        Шымкент    469.86                    43            12  04.янв   В наличии    03.01.2026</w:t>
+              <w:t xml:space="preserve">3  TECH-10004    Мышь Logitech G Pro X Superlight           Мыши  Logitech   </w:t>
               <w:br/>
-              <w:t>4  TECH-10005    Мышь Logitech G Pro X Superlight           Мыши  Logitech        Уральск    134.73                    58            12     5.0  Распродано    22.03.2025</w:t>
+              <w:t xml:space="preserve">4  TECH-10005    Мышь Logitech G Pro X Superlight           Мыши  Logitech   </w:t>
               <w:br/>
-              <w:t>5  TECH-10006    Видеокарта NVIDIA RTX 4070 Super  Комплектующие    NVIDIA  Петропавловск   1275.85                    46            24  04.июл   В наличии    22.08.2025</w:t>
+              <w:t xml:space="preserve">5  TECH-10006    Видеокарта NVIDIA RTX 4070 Super  Комплектующие    NVIDIA   </w:t>
               <w:br/>
-              <w:t>6  TECH-10007      Клавиатура Razer BlackWidow V4     Клавиатуры     Razer  Петропавловск    503.94                    12            60  04.мар   Ожидается    16.06.2025</w:t>
+              <w:t xml:space="preserve">6  TECH-10007      Клавиатура Razer BlackWidow V4     Клавиатуры     Razer   </w:t>
               <w:br/>
-              <w:t>7  TECH-10008    Мышь Logitech G Pro X Superlight           Мыши  Logitech      Караганда   1356.84                     9            24  04.май   В наличии    17.06.2025</w:t>
+              <w:t xml:space="preserve">7  TECH-10008    Мышь Logitech G Pro X Superlight           Мыши  Logitech   </w:t>
               <w:br/>
-              <w:t>8  TECH-10009     Ноутбук Apple MacBook Pro 14 M3       Ноутбуки     Apple         Актобе   1979.57                    71            24  04.июл   В наличии    23.08.2025</w:t>
+              <w:t xml:space="preserve">8  TECH-10009     Ноутбук Apple MacBook Pro 14 M3       Ноутбуки     Apple   </w:t>
               <w:br/>
-              <w:t>9  TECH-10010           Монитор 24" Dell P-Series       Мониторы      Dell       Павлодар    572.09                    27            36  04.фев  Распродано    10.02.2026</w:t>
+              <w:t xml:space="preserve">9  TECH-10010           Монитор 24" Dell P-Series       Мониторы      Dell   </w:t>
+              <w:br/>
+              <w:br/>
+              <w:t xml:space="preserve">    Город_склада  Цена_USD  Количество_на_складе  Гарантия_мес Рейтинг      Статус  \</w:t>
+              <w:br/>
+              <w:t xml:space="preserve">0         Алматы   1496.02                    31            24  04.янв   В наличии   </w:t>
+              <w:br/>
+              <w:t xml:space="preserve">1         Алматы    108.10                    27            24  04.май   В наличии   </w:t>
+              <w:br/>
+              <w:t xml:space="preserve">2      Караганда    925.96                    35            12  04.авг   В наличии   </w:t>
+              <w:br/>
+              <w:t xml:space="preserve">3        Шымкент    469.86                    43            12  04.янв   В наличии   </w:t>
+              <w:br/>
+              <w:t xml:space="preserve">4        Уральск    134.73                    58            12     5.0  Распродано   </w:t>
+              <w:br/>
+              <w:t xml:space="preserve">5  Петропавловск   1275.85                    46            24  04.июл   В наличии   </w:t>
+              <w:br/>
+              <w:t xml:space="preserve">6  Петропавловск    503.94                    12            60  04.мар   Ожидается   </w:t>
+              <w:br/>
+              <w:t xml:space="preserve">7      Караганда   1356.84                     9            24  04.май   В наличии   </w:t>
+              <w:br/>
+              <w:t xml:space="preserve">8         Актобе   1979.57                    71            24  04.июл   В наличии   </w:t>
+              <w:br/>
+              <w:t xml:space="preserve">9       Павлодар    572.09                    27            36  04.фев  Распродано   </w:t>
+              <w:br/>
+              <w:br/>
+              <w:t xml:space="preserve">  Дата_поставки  </w:t>
+              <w:br/>
+              <w:t xml:space="preserve">0    13.07.2026  </w:t>
+              <w:br/>
+              <w:t xml:space="preserve">1    29.07.2026  </w:t>
+              <w:br/>
+              <w:t xml:space="preserve">2    09.03.2026  </w:t>
+              <w:br/>
+              <w:t xml:space="preserve">3    03.01.2026  </w:t>
+              <w:br/>
+              <w:t xml:space="preserve">4    22.03.2025  </w:t>
+              <w:br/>
+              <w:t xml:space="preserve">5    22.08.2025  </w:t>
+              <w:br/>
+              <w:t xml:space="preserve">6    16.06.2025  </w:t>
+              <w:br/>
+              <w:t xml:space="preserve">7    17.06.2025  </w:t>
+              <w:br/>
+              <w:t xml:space="preserve">8    23.08.2025  </w:t>
+              <w:br/>
+              <w:t>9    10.02.2026</w:t>
             </w:r>
           </w:p>
         </w:tc>
@@ -1391,7 +1437,7 @@
               <w:rPr>
                 <w:rFonts w:ascii="Courier New" w:hAnsi="Courier New"/>
                 <w:color w:val="4ADE80"/>
-                <w:sz w:val="14"/>
+                <w:sz w:val="17"/>
               </w:rPr>
               <w:t>&gt;&gt;&gt; Python Console Output:</w:t>
               <w:br/>
@@ -1507,7 +1553,7 @@
               <w:rPr>
                 <w:rFonts w:ascii="Courier New" w:hAnsi="Courier New"/>
                 <w:color w:val="4ADE80"/>
-                <w:sz w:val="14"/>
+                <w:sz w:val="17"/>
               </w:rPr>
               <w:t>&gt;&gt;&gt; Python Console Output:</w:t>
               <w:br/>
@@ -1678,7 +1724,7 @@
               <w:rPr>
                 <w:rFonts w:ascii="Courier New" w:hAnsi="Courier New"/>
                 <w:color w:val="4ADE80"/>
-                <w:sz w:val="14"/>
+                <w:sz w:val="17"/>
               </w:rPr>
               <w:t>&gt;&gt;&gt; Python Console Output:</w:t>
               <w:br/>
@@ -1808,7 +1854,7 @@
               <w:rPr>
                 <w:rFonts w:ascii="Courier New" w:hAnsi="Courier New"/>
                 <w:color w:val="4ADE80"/>
-                <w:sz w:val="14"/>
+                <w:sz w:val="17"/>
               </w:rPr>
               <w:t>&gt;&gt;&gt; Python Console Output:</w:t>
               <w:br/>
@@ -1965,7 +2011,7 @@
               <w:rPr>
                 <w:rFonts w:ascii="Courier New" w:hAnsi="Courier New"/>
                 <w:color w:val="4ADE80"/>
-                <w:sz w:val="14"/>
+                <w:sz w:val="17"/>
               </w:rPr>
               <w:t>&gt;&gt;&gt; Python Console Output:</w:t>
               <w:br/>
@@ -2115,7 +2161,7 @@
               <w:rPr>
                 <w:rFonts w:ascii="Courier New" w:hAnsi="Courier New"/>
                 <w:color w:val="4ADE80"/>
-                <w:sz w:val="14"/>
+                <w:sz w:val="17"/>
               </w:rPr>
               <w:t>&gt;&gt;&gt; Python Console Output:</w:t>
               <w:br/>
@@ -2283,7 +2329,7 @@
               <w:rPr>
                 <w:rFonts w:ascii="Courier New" w:hAnsi="Courier New"/>
                 <w:color w:val="4ADE80"/>
-                <w:sz w:val="14"/>
+                <w:sz w:val="17"/>
               </w:rPr>
               <w:t>&gt;&gt;&gt; Python Console Output:</w:t>
               <w:br/>
@@ -2401,7 +2447,7 @@
               <w:rPr>
                 <w:rFonts w:ascii="Courier New" w:hAnsi="Courier New"/>
                 <w:color w:val="4ADE80"/>
-                <w:sz w:val="14"/>
+                <w:sz w:val="17"/>
               </w:rPr>
               <w:t>&gt;&gt;&gt; Python Console Output:</w:t>
               <w:br/>
@@ -2515,13 +2561,17 @@
               <w:rPr>
                 <w:rFonts w:ascii="Courier New" w:hAnsi="Courier New"/>
                 <w:color w:val="4ADE80"/>
-                <w:sz w:val="14"/>
+                <w:sz w:val="17"/>
               </w:rPr>
               <w:t>&gt;&gt;&gt; Python Console Output:</w:t>
               <w:br/>
               <w:t>--- 10 ---</w:t>
               <w:br/>
-              <w:t>Index(['Наименование', 'Категория', 'Бренд', 'Город_склада', 'Цена_USD', 'Количество_на_складе', 'Гарантия_мес', 'Рейтинг', 'Статус', 'Дата_поставки'], dtype='str')</w:t>
+              <w:t>Index(['Наименование', 'Категория', 'Бренд', 'Город_склада', 'Цена_USD',</w:t>
+              <w:br/>
+              <w:t xml:space="preserve">       'Количество_на_складе', 'Гарантия_мес', 'Рейтинг', 'Статус', 'Дата_поставки'],</w:t>
+              <w:br/>
+              <w:t xml:space="preserve">      dtype='str')</w:t>
             </w:r>
           </w:p>
         </w:tc>
@@ -2643,7 +2693,7 @@
               <w:rPr>
                 <w:rFonts w:ascii="Courier New" w:hAnsi="Courier New"/>
                 <w:color w:val="4ADE80"/>
-                <w:sz w:val="14"/>
+                <w:sz w:val="17"/>
               </w:rPr>
               <w:t>&gt;&gt;&gt; Python Console Output:</w:t>
               <w:br/>
@@ -2653,17 +2703,30 @@
               <w:br/>
               <w:t>Орташа бағадан жоғары тауарлар саны: 304</w:t>
               <w:br/>
-              <w:t xml:space="preserve">                          Наименование      Категория     Бренд   Город_склада  Цена_USD  Количество_на_складе  Гарантия_мес Рейтинг     Статус Дата_поставки</w:t>
+              <w:t xml:space="preserve">                          Наименование      Категория     Бренд   Город_склада  \</w:t>
               <w:br/>
-              <w:t>0   SSD накопитель Samsung 980 PRO 1TB  Комплектующие   Samsung         Алматы   1496.02                    31            24  04.янв  В наличии    13.07.2026</w:t>
+              <w:t xml:space="preserve">0   SSD накопитель Samsung 980 PRO 1TB  Комплектующие   Samsung         Алматы   </w:t>
               <w:br/>
-              <w:t>5     Видеокарта NVIDIA RTX 4070 Super  Комплектующие    NVIDIA  Петропавловск   1275.85                    46            24  04.июл  В наличии    22.08.2025</w:t>
+              <w:t xml:space="preserve">5     Видеокарта NVIDIA RTX 4070 Super  Комплектующие    NVIDIA  Петропавловск   </w:t>
               <w:br/>
-              <w:t>7     Мышь Logitech G Pro X Superlight           Мыши  Logitech      Караганда   1356.84                     9            24  04.май  В наличии    17.06.2025</w:t>
+              <w:t xml:space="preserve">7     Мышь Logitech G Pro X Superlight           Мыши  Logitech      Караганда   </w:t>
               <w:br/>
-              <w:t>8      Ноутбук Apple MacBook Pro 14 M3       Ноутбуки     Apple         Актобе   1979.57                    71            24  04.июл  В наличии    23.08.2025</w:t>
+              <w:t xml:space="preserve">8      Ноутбук Apple MacBook Pro 14 M3       Ноутбуки     Apple         Актобе   </w:t>
               <w:br/>
-              <w:t>11        Ноутбук ASUS Zenbook 14 OLED       Ноутбуки      ASUS      Караганда   1994.79                    17            60  04.янв  В наличии    23.04.2025</w:t>
+              <w:t xml:space="preserve">11        Ноутбук ASUS Zenbook 14 OLED       Ноутбуки      ASUS      Караганда   </w:t>
+              <w:br/>
+              <w:br/>
+              <w:t xml:space="preserve">    Цена_USD  Количество_на_складе  Гарантия_мес Рейтинг     Статус Дата_поставки  </w:t>
+              <w:br/>
+              <w:t xml:space="preserve">0    1496.02                    31            24  04.янв  В наличии    13.07.2026  </w:t>
+              <w:br/>
+              <w:t xml:space="preserve">5    1275.85                    46            24  04.июл  В наличии    22.08.2025  </w:t>
+              <w:br/>
+              <w:t xml:space="preserve">7    1356.84                     9            24  04.май  В наличии    17.06.2025  </w:t>
+              <w:br/>
+              <w:t xml:space="preserve">8    1979.57                    71            24  04.июл  В наличии    23.08.2025  </w:t>
+              <w:br/>
+              <w:t>11   1994.79                    17            60  04.янв  В наличии    23.04.2025</w:t>
             </w:r>
           </w:p>
         </w:tc>
@@ -2777,7 +2840,7 @@
               <w:rPr>
                 <w:rFonts w:ascii="Courier New" w:hAnsi="Courier New"/>
                 <w:color w:val="4ADE80"/>
-                <w:sz w:val="14"/>
+                <w:sz w:val="17"/>
               </w:rPr>
               <w:t>&gt;&gt;&gt; Python Console Output:</w:t>
               <w:br/>
@@ -2785,17 +2848,30 @@
               <w:br/>
               <w:t>Табылған жазбалар саны: 22</w:t>
               <w:br/>
-              <w:t xml:space="preserve">                           Наименование      Категория    Бренд Город_склада  Цена_USD  Количество_на_складе  Гарантия_мес Рейтинг     Статус Дата_поставки</w:t>
+              <w:t xml:space="preserve">                           Наименование      Категория    Бренд Город_склада  \</w:t>
               <w:br/>
-              <w:t>0    SSD накопитель Samsung 980 PRO 1TB  Комплектующие  Samsung       Алматы   1496.02                    31            24  04.янв  В наличии    13.07.2026</w:t>
+              <w:t xml:space="preserve">0    SSD накопитель Samsung 980 PRO 1TB  Комплектующие  Samsung       Алматы   </w:t>
               <w:br/>
-              <w:t>25        Видеокарта NVIDIA RTX 4060 Ti  Комплектующие   NVIDIA       Алматы   1321.68                    69            12     5.0  В наличии    20.06.2025</w:t>
+              <w:t xml:space="preserve">25        Видеокарта NVIDIA RTX 4060 Ti  Комплектующие   NVIDIA       Алматы   </w:t>
               <w:br/>
-              <w:t>29        Видеокарта NVIDIA RTX 4060 Ti  Комплектующие   NVIDIA       Алматы   1923.52                    10            24  04.янв  В наличии    29.08.2025</w:t>
+              <w:t xml:space="preserve">29        Видеокарта NVIDIA RTX 4060 Ti  Комплектующие   NVIDIA       Алматы   </w:t>
               <w:br/>
-              <w:t>71     Видеокарта NVIDIA RTX 4070 Super  Комплектующие   NVIDIA       Алматы   1706.67                    62            12  04.апр  Ожидается    16.04.2026</w:t>
+              <w:t xml:space="preserve">71     Видеокарта NVIDIA RTX 4070 Super  Комплектующие   NVIDIA       Алматы   </w:t>
               <w:br/>
-              <w:t>105    Видеокарта NVIDIA RTX 4070 Super  Комплектующие   NVIDIA       Алматы   1458.77                    52            24  04.янв  Ожидается    13.12.2025</w:t>
+              <w:t xml:space="preserve">105    Видеокарта NVIDIA RTX 4070 Super  Комплектующие   NVIDIA       Алматы   </w:t>
+              <w:br/>
+              <w:br/>
+              <w:t xml:space="preserve">     Цена_USD  Количество_на_складе  Гарантия_мес Рейтинг     Статус Дата_поставки  </w:t>
+              <w:br/>
+              <w:t xml:space="preserve">0     1496.02                    31            24  04.янв  В наличии    13.07.2026  </w:t>
+              <w:br/>
+              <w:t xml:space="preserve">25    1321.68                    69            12     5.0  В наличии    20.06.2025  </w:t>
+              <w:br/>
+              <w:t xml:space="preserve">29    1923.52                    10            24  04.янв  В наличии    29.08.2025  </w:t>
+              <w:br/>
+              <w:t xml:space="preserve">71    1706.67                    62            12  04.апр  Ожидается    16.04.2026  </w:t>
+              <w:br/>
+              <w:t>105   1458.77                    52            24  04.янв  Ожидается    13.12.2025</w:t>
             </w:r>
           </w:p>
         </w:tc>
@@ -2899,33 +2975,56 @@
               <w:rPr>
                 <w:rFonts w:ascii="Courier New" w:hAnsi="Courier New"/>
                 <w:color w:val="4ADE80"/>
-                <w:sz w:val="14"/>
+                <w:sz w:val="17"/>
               </w:rPr>
               <w:t>&gt;&gt;&gt; Python Console Output:</w:t>
               <w:br/>
               <w:t>--- 13 ---</w:t>
               <w:br/>
-              <w:t xml:space="preserve">                           Наименование      Категория     Бренд Город_склада  Цена_USD  Количество_на_складе  Гарантия_мес Рейтинг      Статус Дата_поставки</w:t>
+              <w:t xml:space="preserve">                           Наименование      Категория     Бренд Город_склада  \</w:t>
               <w:br/>
-              <w:t>133  SSD накопитель Samsung 980 PRO 1TB  Комплектующие   Samsung       Алматы   1997.24                    51            60  04.июл  Распродано    31.03.2026</w:t>
+              <w:t xml:space="preserve">133  SSD накопитель Samsung 980 PRO 1TB  Комплектующие   Samsung       Алматы   </w:t>
               <w:br/>
-              <w:t>591   Монитор 34" Dell Alienware Curved       Мониторы      Dell     Костанай   1994.87                    57            12  04.фев   Ожидается    08.02.2026</w:t>
+              <w:t xml:space="preserve">591   Монитор 34" Dell Alienware Curved       Мониторы      Dell     Костанай   </w:t>
               <w:br/>
-              <w:t>11         Ноутбук ASUS Zenbook 14 OLED       Ноутбуки      ASUS    Караганда   1994.79                    17            60  04.янв   В наличии    23.04.2025</w:t>
+              <w:t xml:space="preserve">11         Ноутбук ASUS Zenbook 14 OLED       Ноутбуки      ASUS    Караганда   </w:t>
               <w:br/>
-              <w:t>428      Процессор Intel Core i5-13400F  Комплектующие     Intel    Кызылорда   1989.63                    13            12     4.0   В наличии    03.03.2026</w:t>
+              <w:t xml:space="preserve">428      Процессор Intel Core i5-13400F  Комплектующие     Intel    Кызылорда   </w:t>
               <w:br/>
-              <w:t>84     Монитор 27" ASUS ROG Swift 240Hz       Мониторы      ASUS       Астана   1988.14                    15            60  04.июн   В наличии    20.06.2026</w:t>
+              <w:t xml:space="preserve">84     Монитор 27" ASUS ROG Swift 240Hz       Мониторы      ASUS       Астана   </w:t>
               <w:br/>
-              <w:t>247  SSD накопитель Samsung 990 PRO 2TB  Комплектующие   Samsung        Тараз   1986.07                    48            60  04.сен  Распродано    20.01.2026</w:t>
+              <w:t xml:space="preserve">247  SSD накопитель Samsung 990 PRO 2TB  Комплектующие   Samsung        Тараз   </w:t>
               <w:br/>
-              <w:t>278  SSD накопитель Samsung 990 PRO 2TB  Комплектующие   Samsung      Уральск   1985.54                    62            24  04.апр  Распродано    19.03.2026</w:t>
+              <w:t xml:space="preserve">278  SSD накопитель Samsung 990 PRO 2TB  Комплектующие   Samsung      Уральск   </w:t>
               <w:br/>
-              <w:t>8       Ноутбук Apple MacBook Pro 14 M3       Ноутбуки     Apple       Актобе   1979.57                    71            24  04.июл   В наличии    23.08.2025</w:t>
+              <w:t xml:space="preserve">8       Ноутбук Apple MacBook Pro 14 M3       Ноутбуки     Apple       Актобе   </w:t>
               <w:br/>
-              <w:t>419   Клавиатура Logitech MX Mechanical     Клавиатуры  Logitech     Павлодар   1975.02                    58            24  04.мар   В наличии    24.03.2025</w:t>
+              <w:t xml:space="preserve">419   Клавиатура Logitech MX Mechanical     Клавиатуры  Logitech     Павлодар   </w:t>
               <w:br/>
-              <w:t>420     Ноутбук Apple MacBook Pro 14 M3       Ноутбуки     Apple       Атырау   1973.95                    40            12     4.0   Ожидается    03.08.2025</w:t>
+              <w:t xml:space="preserve">420     Ноутбук Apple MacBook Pro 14 M3       Ноутбуки     Apple       Атырау   </w:t>
+              <w:br/>
+              <w:br/>
+              <w:t xml:space="preserve">     Цена_USD  Количество_на_складе  Гарантия_мес Рейтинг      Статус Дата_поставки  </w:t>
+              <w:br/>
+              <w:t xml:space="preserve">133   1997.24                    51            60  04.июл  Распродано    31.03.2026  </w:t>
+              <w:br/>
+              <w:t xml:space="preserve">591   1994.87                    57            12  04.фев   Ожидается    08.02.2026  </w:t>
+              <w:br/>
+              <w:t xml:space="preserve">11    1994.79                    17            60  04.янв   В наличии    23.04.2025  </w:t>
+              <w:br/>
+              <w:t xml:space="preserve">428   1989.63                    13            12     4.0   В наличии    03.03.2026  </w:t>
+              <w:br/>
+              <w:t xml:space="preserve">84    1988.14                    15            60  04.июн   В наличии    20.06.2026  </w:t>
+              <w:br/>
+              <w:t xml:space="preserve">247   1986.07                    48            60  04.сен  Распродано    20.01.2026  </w:t>
+              <w:br/>
+              <w:t xml:space="preserve">278   1985.54                    62            24  04.апр  Распродано    19.03.2026  </w:t>
+              <w:br/>
+              <w:t xml:space="preserve">8     1979.57                    71            24  04.июл   В наличии    23.08.2025  </w:t>
+              <w:br/>
+              <w:t xml:space="preserve">419   1975.02                    58            24  04.мар   В наличии    24.03.2025  </w:t>
+              <w:br/>
+              <w:t>420   1973.95                    40            12     4.0   Ожидается    03.08.2025</w:t>
             </w:r>
           </w:p>
         </w:tc>
@@ -3029,23 +3128,36 @@
               <w:rPr>
                 <w:rFonts w:ascii="Courier New" w:hAnsi="Courier New"/>
                 <w:color w:val="4ADE80"/>
-                <w:sz w:val="14"/>
+                <w:sz w:val="17"/>
               </w:rPr>
               <w:t>&gt;&gt;&gt; Python Console Output:</w:t>
               <w:br/>
               <w:t>--- 14 ---</w:t>
               <w:br/>
-              <w:t xml:space="preserve">                           Наименование      Категория     Бренд      Город_склада  Цена_USD  Количество_на_складе  Гарантия_мес Рейтинг      Статус Дата_поставки</w:t>
+              <w:t xml:space="preserve">                           Наименование      Категория     Бренд      Город_склада  \</w:t>
               <w:br/>
-              <w:t>101    Мышь Logitech G Pro X Superlight           Мыши  Logitech     Петропавловск     55.00                    38            60  04.сен  Распродано    06.07.2026</w:t>
+              <w:t xml:space="preserve">101    Мышь Logitech G Pro X Superlight           Мыши  Logitech     Петропавловск   </w:t>
               <w:br/>
-              <w:t>433     Ноутбук Apple MacBook Pro 14 M3       Ноутбуки     Apple         Караганда     55.34                    11            12  04.авг  Распродано    02.06.2025</w:t>
+              <w:t xml:space="preserve">433     Ноутбук Apple MacBook Pro 14 M3       Ноутбуки     Apple         Караганда   </w:t>
               <w:br/>
-              <w:t>245        Ноутбук ASUS Zenbook 14 OLED       Ноутбуки      ASUS     Петропавловск     55.88                    27            12     4.0   Ожидается    07.03.2025</w:t>
+              <w:t xml:space="preserve">245        Ноутбук ASUS Zenbook 14 OLED       Ноутбуки      ASUS     Петропавловск   </w:t>
               <w:br/>
-              <w:t>249         Монитор 24" ASUS TUF Gaming       Мониторы      ASUS     Петропавловск     56.77                     2            36  04.май  Распродано    29.06.2026</w:t>
+              <w:t xml:space="preserve">249         Монитор 24" ASUS TUF Gaming       Мониторы      ASUS     Петропавловск   </w:t>
               <w:br/>
-              <w:t>453  SSD накопитель Samsung 980 PRO 1TB  Комплектующие   Samsung  Усть-Каменогорск     58.46                     6            60  04.авг  Распродано    05.06.2026</w:t>
+              <w:t xml:space="preserve">453  SSD накопитель Samsung 980 PRO 1TB  Комплектующие   Samsung  Усть-Каменогорск   </w:t>
+              <w:br/>
+              <w:br/>
+              <w:t xml:space="preserve">     Цена_USD  Количество_на_складе  Гарантия_мес Рейтинг      Статус Дата_поставки  </w:t>
+              <w:br/>
+              <w:t xml:space="preserve">101     55.00                    38            60  04.сен  Распродано    06.07.2026  </w:t>
+              <w:br/>
+              <w:t xml:space="preserve">433     55.34                    11            12  04.авг  Распродано    02.06.2025  </w:t>
+              <w:br/>
+              <w:t xml:space="preserve">245     55.88                    27            12     4.0   Ожидается    07.03.2025  </w:t>
+              <w:br/>
+              <w:t xml:space="preserve">249     56.77                     2            36  04.май  Распродано    29.06.2026  </w:t>
+              <w:br/>
+              <w:t>453     58.46                     6            60  04.авг  Распродано    05.06.2026</w:t>
             </w:r>
           </w:p>
         </w:tc>
@@ -3155,33 +3267,56 @@
               <w:rPr>
                 <w:rFonts w:ascii="Courier New" w:hAnsi="Courier New"/>
                 <w:color w:val="4ADE80"/>
-                <w:sz w:val="14"/>
+                <w:sz w:val="17"/>
               </w:rPr>
               <w:t>&gt;&gt;&gt; Python Console Output:</w:t>
               <w:br/>
               <w:t>--- 15 ---</w:t>
               <w:br/>
-              <w:t xml:space="preserve">                           Наименование      Категория     Бренд Город_склада  Цена_USD  Количество_на_складе  Гарантия_мес Рейтинг      Статус Дата_поставки</w:t>
+              <w:t xml:space="preserve">                           Наименование      Категория     Бренд Город_склада  \</w:t>
               <w:br/>
-              <w:t>133  SSD накопитель Samsung 980 PRO 1TB  Комплектующие   Samsung       Алматы   1997.24                    51            60  04.июл  Распродано    31.03.2026</w:t>
+              <w:t xml:space="preserve">133  SSD накопитель Samsung 980 PRO 1TB  Комплектующие   Samsung       Алматы   </w:t>
               <w:br/>
-              <w:t>591   Монитор 34" Dell Alienware Curved       Мониторы      Dell     Костанай   1994.87                    57            12  04.фев   Ожидается    08.02.2026</w:t>
+              <w:t xml:space="preserve">591   Монитор 34" Dell Alienware Curved       Мониторы      Dell     Костанай   </w:t>
               <w:br/>
-              <w:t>11         Ноутбук ASUS Zenbook 14 OLED       Ноутбуки      ASUS    Караганда   1994.79                    17            60  04.янв   В наличии    23.04.2025</w:t>
+              <w:t xml:space="preserve">11         Ноутбук ASUS Zenbook 14 OLED       Ноутбуки      ASUS    Караганда   </w:t>
               <w:br/>
-              <w:t>428      Процессор Intel Core i5-13400F  Комплектующие     Intel    Кызылорда   1989.63                    13            12     4.0   В наличии    03.03.2026</w:t>
+              <w:t xml:space="preserve">428      Процессор Intel Core i5-13400F  Комплектующие     Intel    Кызылорда   </w:t>
               <w:br/>
-              <w:t>84     Монитор 27" ASUS ROG Swift 240Hz       Мониторы      ASUS       Астана   1988.14                    15            60  04.июн   В наличии    20.06.2026</w:t>
+              <w:t xml:space="preserve">84     Монитор 27" ASUS ROG Swift 240Hz       Мониторы      ASUS       Астана   </w:t>
               <w:br/>
-              <w:t>247  SSD накопитель Samsung 990 PRO 2TB  Комплектующие   Samsung        Тараз   1986.07                    48            60  04.сен  Распродано    20.01.2026</w:t>
+              <w:t xml:space="preserve">247  SSD накопитель Samsung 990 PRO 2TB  Комплектующие   Samsung        Тараз   </w:t>
               <w:br/>
-              <w:t>278  SSD накопитель Samsung 990 PRO 2TB  Комплектующие   Samsung      Уральск   1985.54                    62            24  04.апр  Распродано    19.03.2026</w:t>
+              <w:t xml:space="preserve">278  SSD накопитель Samsung 990 PRO 2TB  Комплектующие   Samsung      Уральск   </w:t>
               <w:br/>
-              <w:t>8       Ноутбук Apple MacBook Pro 14 M3       Ноутбуки     Apple       Актобе   1979.57                    71            24  04.июл   В наличии    23.08.2025</w:t>
+              <w:t xml:space="preserve">8       Ноутбук Apple MacBook Pro 14 M3       Ноутбуки     Apple       Актобе   </w:t>
               <w:br/>
-              <w:t>419   Клавиатура Logitech MX Mechanical     Клавиатуры  Logitech     Павлодар   1975.02                    58            24  04.мар   В наличии    24.03.2025</w:t>
+              <w:t xml:space="preserve">419   Клавиатура Logitech MX Mechanical     Клавиатуры  Logitech     Павлодар   </w:t>
               <w:br/>
-              <w:t>420     Ноутбук Apple MacBook Pro 14 M3       Ноутбуки     Apple       Атырау   1973.95                    40            12     4.0   Ожидается    03.08.2025</w:t>
+              <w:t xml:space="preserve">420     Ноутбук Apple MacBook Pro 14 M3       Ноутбуки     Apple       Атырау   </w:t>
+              <w:br/>
+              <w:br/>
+              <w:t xml:space="preserve">     Цена_USD  Количество_на_складе  Гарантия_мес Рейтинг      Статус Дата_поставки  </w:t>
+              <w:br/>
+              <w:t xml:space="preserve">133   1997.24                    51            60  04.июл  Распродано    31.03.2026  </w:t>
+              <w:br/>
+              <w:t xml:space="preserve">591   1994.87                    57            12  04.фев   Ожидается    08.02.2026  </w:t>
+              <w:br/>
+              <w:t xml:space="preserve">11    1994.79                    17            60  04.янв   В наличии    23.04.2025  </w:t>
+              <w:br/>
+              <w:t xml:space="preserve">428   1989.63                    13            12     4.0   В наличии    03.03.2026  </w:t>
+              <w:br/>
+              <w:t xml:space="preserve">84    1988.14                    15            60  04.июн   В наличии    20.06.2026  </w:t>
+              <w:br/>
+              <w:t xml:space="preserve">247   1986.07                    48            60  04.сен  Распродано    20.01.2026  </w:t>
+              <w:br/>
+              <w:t xml:space="preserve">278   1985.54                    62            24  04.апр  Распродано    19.03.2026  </w:t>
+              <w:br/>
+              <w:t xml:space="preserve">8     1979.57                    71            24  04.июл   В наличии    23.08.2025  </w:t>
+              <w:br/>
+              <w:t xml:space="preserve">419   1975.02                    58            24  04.мар   В наличии    24.03.2025  </w:t>
+              <w:br/>
+              <w:t>420   1973.95                    40            12     4.0   Ожидается    03.08.2025</w:t>
             </w:r>
           </w:p>
         </w:tc>
@@ -3312,7 +3447,7 @@
               <w:rPr>
                 <w:rFonts w:ascii="Courier New" w:hAnsi="Courier New"/>
                 <w:color w:val="4ADE80"/>
-                <w:sz w:val="14"/>
+                <w:sz w:val="17"/>
               </w:rPr>
               <w:t>&gt;&gt;&gt; Python Console Output:</w:t>
               <w:br/>
@@ -3470,7 +3605,7 @@
               <w:rPr>
                 <w:rFonts w:ascii="Courier New" w:hAnsi="Courier New"/>
                 <w:color w:val="4ADE80"/>
-                <w:sz w:val="14"/>
+                <w:sz w:val="17"/>
               </w:rPr>
               <w:t>&gt;&gt;&gt; Python Console Output:</w:t>
               <w:br/>
@@ -3599,7 +3734,7 @@
               <w:rPr>
                 <w:rFonts w:ascii="Courier New" w:hAnsi="Courier New"/>
                 <w:color w:val="4ADE80"/>
-                <w:sz w:val="14"/>
+                <w:sz w:val="17"/>
               </w:rPr>
               <w:t>&gt;&gt;&gt; Python Console Output:</w:t>
               <w:br/>
@@ -3722,7 +3857,7 @@
               <w:rPr>
                 <w:rFonts w:ascii="Courier New" w:hAnsi="Courier New"/>
                 <w:color w:val="4ADE80"/>
-                <w:sz w:val="14"/>
+                <w:sz w:val="17"/>
               </w:rPr>
               <w:t>&gt;&gt;&gt; Python Console Output:</w:t>
               <w:br/>
@@ -3853,7 +3988,7 @@
               <w:rPr>
                 <w:rFonts w:ascii="Courier New" w:hAnsi="Courier New"/>
                 <w:color w:val="4ADE80"/>
-                <w:sz w:val="14"/>
+                <w:sz w:val="17"/>
               </w:rPr>
               <w:t>&gt;&gt;&gt; Python Console Output:</w:t>
               <w:br/>

</xml_diff>